<commit_message>
Prepare verified course distribution from d583154853a110262e01370daad6d2be916389c9
</commit_message>
<xml_diff>
--- a/mandarin/materials/teacher-guide.docx
+++ b/mandarin/materials/teacher-guide.docx
@@ -32,7 +32,7 @@
         <w:rPr>
           <w:b w:val="0"/>
         </w:rPr>
-        <w:t>Сценарий помогает провести занятия по пособие «Мандарин» и организовать переход между ними. Порядок исходных заданий сохранён. Все реплики, выделенные словом «Предложение», написаны составителем для рабочей адаптации. При проведении держите рядом пособие «Мандарин» и оригинальную тетрадь исходная тетрадь.</w:t>
+        <w:t>Сценарий помогает провести занятия по пособию «Мандарин» и организовать переход между ними. Порядок исходных заданий сохранён. Все реплики, выделенные словом «Предложение», написаны составителем для рабочей адаптации. При проведении держите рядом пособие «Мандарин» и исходную рабочую тетрадь.</w:t>
       </w:r>
     </w:p>
     <w:p>
@@ -56,7 +56,7 @@
         <w:pStyle w:val="ListBullet"/>
       </w:pPr>
       <w:r>
-        <w:t>Подготовить исходная тетрадь и презентация; не открывать детям слайд 9 с ответом заранее.</w:t>
+        <w:t>Подготовить исходную тетрадь и презентацию; не открывать детям слайд 9 с ответом заранее.</w:t>
       </w:r>
     </w:p>
     <w:p>
@@ -72,7 +72,7 @@
         <w:pStyle w:val="ListBullet"/>
       </w:pPr>
       <w:r>
-        <w:t>Наметить промежуток для общего дела после третьей встречи; оставить выбор конкретного дела детям.</w:t>
+        <w:t>Наметить промежуток для общего дела после третьего занятия; оставить выбор конкретного дела детям.</w:t>
       </w:r>
     </w:p>
     <w:p>
@@ -127,7 +127,7 @@
                 <w:b/>
                 <w:sz w:val="19"/>
               </w:rPr>
-              <w:t>Встреча</w:t>
+              <w:t>Занятие</w:t>
             </w:r>
           </w:p>
         </w:tc>
@@ -714,7 +714,7 @@
         <w:pStyle w:val="Heading1"/>
       </w:pPr>
       <w:r>
-        <w:t>Первая встреча Впечатление</w:t>
+        <w:t>Первое занятие Впечатление</w:t>
       </w:r>
     </w:p>
     <w:p>
@@ -739,7 +739,7 @@
         <w:rPr>
           <w:b w:val="0"/>
         </w:rPr>
-        <w:t>Провести мотивационное упражнение по пособие «Мандарин», с. 1–2. Для задания 1 показать цвета со слайда 1. Выслушать разные ощущения. Исходник прямо допускает разные ответы; цвет не превращается в оценку ребёнка.</w:t>
+        <w:t>Провести мотивационное упражнение по пособию «Мандарин», с. 1–2. Для задания 1 показать цвета со слайда 1. Выслушать разные ощущения. Исходник прямо допускает разные ответы; цвет не превращается в оценку ребёнка.</w:t>
       </w:r>
     </w:p>
     <w:p>
@@ -787,7 +787,7 @@
         <w:rPr>
           <w:b w:val="0"/>
         </w:rPr>
-        <w:t>Дать задание 2 и слайд 8. Дети восстанавливают последовательность пяти моментов, затем объясняют свой порядок. Только после попытки показать слайд 9. Ориентир из пособие «Мандарин», с. 4: качели → проходит мимо Тимофея в школе → наблюдает за играми → разговор с учителем → новый герой из мандарина.</w:t>
+        <w:t>Дать задание 2 и слайд 8. Дети восстанавливают последовательность пяти моментов, затем объясняют свой порядок. Только после попытки показать слайд 9. Ориентир из пособия «Мандарин», с. 4: качели → проходит мимо Тимофея в школе → наблюдает за играми → разговор с учителем → новый герой из мандарина.</w:t>
       </w:r>
     </w:p>
     <w:p>
@@ -832,7 +832,7 @@
         <w:pStyle w:val="Heading1"/>
       </w:pPr>
       <w:r>
-        <w:t>Вторая встреча Осмысление</w:t>
+        <w:t>Второе занятие Осмысление</w:t>
       </w:r>
     </w:p>
     <w:p>
@@ -857,7 +857,7 @@
         <w:rPr>
           <w:b w:val="0"/>
         </w:rPr>
-        <w:t>Провести упражнение «Повторяй-ка» по пособие «Мандарин», с. 6–7, затем вспомнить имена героев. В задании 5 рассмотреть три момента: отказ Кристины от мандарина, находку Насти и появление нового мандаринового героя в финале. Смайлик дополняется словом или объяснением, если ребёнок хочет.</w:t>
+        <w:t>Провести упражнение «Повторяй-ка» по пособию «Мандарин», с. 6–7, затем вспомнить имена героев. В задании 5 рассмотреть три момента: отказ Кристины от мандарина, находку Насти и появление нового мандаринового героя в финале. Смайлик дополняется словом или объяснением, если ребёнок хочет.</w:t>
       </w:r>
     </w:p>
     <w:p>
@@ -865,7 +865,7 @@
         <w:rPr>
           <w:b w:val="0"/>
         </w:rPr>
-        <w:t>«Живые картинки» из пособие «Мандарин», с. 8, проводить бережно. Предложение адаптации: предложить ребёнку выбрать участие или наблюдение, не закреплять за ним роль «обидчика» и не связывать роль с его характером.</w:t>
+        <w:t>«Живые картинки» из пособия «Мандарин», с. 8, проводить бережно. Предложение адаптации: предложить ребёнку выбрать участие или наблюдение, не закреплять за ним роль «обидчика» и не связывать роль с его характером.</w:t>
       </w:r>
     </w:p>
     <w:p>
@@ -881,7 +881,7 @@
         <w:rPr>
           <w:b w:val="0"/>
         </w:rPr>
-        <w:t>В задании 6 использовать образ корабля из пособие «Мандарин», с. 9–10. Паруса: доброжелательность, великодушие, чуткость. К каждому названию дети находят действие героя. Слайды 11–14 помогают вернуться к конкретному моменту. Различать «что произошло» и «почему, по-вашему, герой так сделал».</w:t>
+        <w:t>В задании 6 использовать образ корабля из пособия «Мандарин», с. 9–10. Паруса: доброжелательность, великодушие, чуткость. К каждому названию дети находят действие героя. Слайды 11–14 помогают вернуться к конкретному моменту. Различать «что произошло» и «почему, по-вашему, герой так сделал».</w:t>
       </w:r>
     </w:p>
     <w:p>
@@ -905,7 +905,7 @@
         <w:rPr>
           <w:b w:val="0"/>
         </w:rPr>
-        <w:t>Для задания 7 сначала дать исходное условие острова: можно взять только два предмета для обратного пути. Выслушать выбор и доводы, затем обратиться к пояснению пособие «Мандарин», с. 11. В исходнике ориентиром для безопасного плавания названы аптечка и спасательный круг. Условие и источник ответа не скрывать при последующем разборе.</w:t>
+        <w:t>Для задания 7 сначала дать исходное условие острова: можно взять только два предмета для обратного пути. Выслушать выбор и доводы, затем обратиться к пояснению пособия «Мандарин», с. 11. В исходнике ориентиром для безопасного плавания названы аптечка и спасательный круг. Условие и источник ответа не скрывать при последующем разборе.</w:t>
       </w:r>
     </w:p>
     <w:p>
@@ -942,7 +942,7 @@
         <w:pStyle w:val="Heading1"/>
       </w:pPr>
       <w:r>
-        <w:t>Третья встреча Применение</w:t>
+        <w:t>Третье занятие Применение</w:t>
       </w:r>
     </w:p>
     <w:p>
@@ -967,7 +967,7 @@
         <w:rPr>
           <w:b w:val="0"/>
         </w:rPr>
-        <w:t>Использовать «Ритм-старт» и командное упражнение из пособие «Мандарин», с. 12. Ошибка в ритме — повод попробовать снова, а не определить «слабого» участника. После упражнения перейти к рисункам задания 8.</w:t>
+        <w:t>Использовать «Ритм-старт» и командное упражнение из пособия «Мандарин», с. 12. Ошибка в ритме — повод попробовать снова, а не определить «слабого» участника. После упражнения перейти к рисункам задания 8.</w:t>
       </w:r>
     </w:p>
     <w:p>
@@ -991,7 +991,7 @@
         <w:rPr>
           <w:b w:val="0"/>
         </w:rPr>
-        <w:t>Командную игру с мячом провести по пособие «Мандарин», с. 13: сначала победившая команда поддерживает остальных, затем все поздравляют победителей. После игры спросить о конкретных словах и действиях поддержки.</w:t>
+        <w:t>Командную игру с мячом провести по пособию «Мандарин», с. 13: сначала победившая команда поддерживает остальных, затем все поздравляют победителей. После игры спросить о конкретных словах и действиях поддержки.</w:t>
       </w:r>
     </w:p>
     <w:p>
@@ -1015,7 +1015,7 @@
         <w:rPr>
           <w:b w:val="0"/>
         </w:rPr>
-        <w:t>Если идеи не появляются, обратиться к примерам пособие «Мандарин», с. 13–14: открытки с благодарностью, концерт, общее дело о бережном отношении к чужому труду. Обозначить их как подсказки. После обсуждения выбрать одно дело способом, который описан в исходнике, и распределить задачи.</w:t>
+        <w:t>Если идеи не появляются, обратиться к примерам пособия «Мандарин», с. 13–14: открытки с благодарностью, концерт, общее дело о бережном отношении к чужому труду. Обозначить их как подсказки. После обсуждения выбрать одно дело способом, который описан в исходнике, и распределить задачи.</w:t>
       </w:r>
     </w:p>
     <w:p>
@@ -1031,7 +1031,7 @@
         <w:rPr>
           <w:b w:val="0"/>
         </w:rPr>
-        <w:t>Заполнить лист W4: получатель, желаемый результат, действия, роли, помощь взрослых, сроки, способ увидеть пользу. Договориться, когда группа вернётся к обсуждению после дела. Выполнить заключение «Клубок дружбы» по пособие «Мандарин», с. 14–15.</w:t>
+        <w:t>Заполнить лист W4: получатель, желаемый результат, действия, роли, помощь взрослых, сроки, способ увидеть пользу. Договориться, когда группа вернётся к обсуждению после дела. Выполнить заключение «Клубок дружбы» по пособию «Мандарин», с. 14–15.</w:t>
       </w:r>
     </w:p>
     <w:p>
@@ -1052,7 +1052,7 @@
         <w:pStyle w:val="Heading1"/>
       </w:pPr>
       <w:r>
-        <w:t>Четвёртая встреча Рефлексия</w:t>
+        <w:t>Четвёртое занятие Рефлексия</w:t>
       </w:r>
     </w:p>
     <w:p>
@@ -1085,7 +1085,7 @@
         <w:rPr>
           <w:b w:val="0"/>
         </w:rPr>
-        <w:t>Предложение адаптации мотивационного упражнения: разрешить держать глаза открытыми и отвечать добровольно; прикосновение заменять обращением по имени при предпочтении ребёнка. Это предложение составителя к пособие «Мандарин», с. 15, а не изменение оригинала.</w:t>
+        <w:t>Предложение адаптации мотивационного упражнения: разрешить держать глаза открытыми и отвечать добровольно; прикосновение заменять обращением по имени при предпочтении ребёнка. Это предложение составителя к пособию «Мандарин», с. 15, а не изменение оригинала.</w:t>
       </w:r>
     </w:p>
     <w:p>
@@ -1101,7 +1101,7 @@
         <w:rPr>
           <w:b w:val="0"/>
         </w:rPr>
-        <w:t>Использовать условную легенду пособие «Мандарин», с. 15: гордость — красный; удовлетворение — жёлтый; радость — оранжевый; равнодушие — фиолетовый; надежда — голубой; воодушевление — синий. Это правило конкретного рисунка, а не универсальное значение цветов.</w:t>
+        <w:t>Использовать условную легенду пособия «Мандарин», с. 15: гордость — красный; удовлетворение — жёлтый; радость — оранжевый; равнодушие — фиолетовый; надежда — голубой; воодушевление — синий. Это правило конкретного рисунка, а не универсальное значение цветов.</w:t>
       </w:r>
     </w:p>
     <w:p>
@@ -1109,7 +1109,7 @@
         <w:rPr>
           <w:b w:val="0"/>
         </w:rPr>
-        <w:t>По пособие «Мандарин», с. 16: стебель — доброжелательность, корни — воля и искренность, листья — чуткость и великодушие. Связать детали рисунка с пережитым делом. Предложение адаптации: не требовать общего показа личных записей; участник сам решает, что расскажет.</w:t>
+        <w:t>По пособию «Мандарин», с. 16: стебель — доброжелательность, корни — воля и искренность, листья — чуткость и великодушие. Связать детали рисунка с пережитым делом. Предложение адаптации: не требовать общего показа личных записей; участник сам решает, что расскажет.</w:t>
       </w:r>
     </w:p>
     <w:p>
@@ -1125,7 +1125,7 @@
         <w:rPr>
           <w:b w:val="0"/>
         </w:rPr>
-        <w:t>Спросить, что было самым трудным, кто и чем помог, что стало понятно о радости за другого. Можно использовать начала фраз из пособие «Мандарин», с. 16: «Я научился радоваться за…», «Самым сложным было…», «В следующий раз я…».</w:t>
+        <w:t>Спросить, что было самым трудным, кто и чем помог, что стало понятно о радости за другого. Можно использовать начала фраз из пособия «Мандарин», с. 16: «Я научился радоваться за…», «Самым сложным было…», «В следующий раз я…».</w:t>
       </w:r>
     </w:p>
     <w:p>
@@ -1133,7 +1133,7 @@
         <w:rPr>
           <w:b w:val="0"/>
         </w:rPr>
-        <w:t>Перейти от будущего образа к ближайшему посильному действию по пособие «Мандарин», с. 16–17. Лист W5 помогает сохранить одну мысль и один следующий шаг. Не требовать одинакового вывода и не заменять сложное чувство обязательной радостью.</w:t>
+        <w:t>Перейти от будущего образа к ближайшему посильному действию по пособию «Мандарин», с. 16–17. Лист W5 помогает сохранить одну мысль и один следующий шаг. Не требовать одинакового вывода и не заменять сложное чувство обязательной радостью.</w:t>
       </w:r>
     </w:p>
     <w:p>

</xml_diff>